<commit_message>
BTNN: tìm kiếm vụ việc toàn hệ thống, CĐPD, phạm vi BTP/STP, gửi kết quả DVC, chuẩn hóa SRS
- Tìm kiếm vụ việc (Tòa án, GQ): toàn hệ thống, mọi trạng thái, cột như Tra cứu, Tỉnh/Phường
- GQ: Đã tồn tại vụ việc, CĐPD trình ký + Cử người PHDD, Cử người GQBT chọn tài khoản
- BTP/STP: chỉ xem dữ liệu STP, cột Cán bộ xử lý/Đơn vị thực hiện, lọc cây đơn vị
- Gửi kết quả về DVC (16 bước, link tệp + mã băm), Nhật ký đồng bộ DVC (Quản trị HT)
- Kinh phí: chi trả nhiều lần, trả lại NSNN một phần; Tòa án: UX form, chi trả theo vụ Tòa án
- Bỏ Lưu nháp, Tài liệu đính kèm thống nhất, Kết xuất Excel theo quy chuẩn 5.5
- Bàn làm việc Lãnh đạo, seed chuẩn hóa mô hình 2 cấp, SRS rút gọn

Co-Authored-By: Claude Opus 5.5 <noreply@anthropic.com>
</commit_message>
<xml_diff>
--- a/Bieu_mau/Boi_thuong_nha_nuoc/Mau_06_BTNN_Template.docx
+++ b/Bieu_mau/Boi_thuong_nha_nuoc/Mau_06_BTNN_Template.docx
@@ -1,6 +1,6 @@
 
 <file path=word/document.xml><?xml version="1.0" encoding="utf-8"?>
-<w:document xmlns:w="http://schemas.openxmlformats.org/wordprocessingml/2006/main" xmlns:r="http://schemas.openxmlformats.org/officeDocument/2006/relationships">
+<w:document xmlns:wpc="http://schemas.microsoft.com/office/word/2010/wordprocessingCanvas" xmlns:cx="http://schemas.microsoft.com/office/drawing/2014/chartex" xmlns:cx1="http://schemas.microsoft.com/office/drawing/2015/9/8/chartex" xmlns:cx2="http://schemas.microsoft.com/office/drawing/2015/10/21/chartex" xmlns:cx3="http://schemas.microsoft.com/office/drawing/2016/5/9/chartex" xmlns:cx4="http://schemas.microsoft.com/office/drawing/2016/5/10/chartex" xmlns:cx5="http://schemas.microsoft.com/office/drawing/2016/5/11/chartex" xmlns:cx6="http://schemas.microsoft.com/office/drawing/2016/5/12/chartex" xmlns:cx7="http://schemas.microsoft.com/office/drawing/2016/5/13/chartex" xmlns:cx8="http://schemas.microsoft.com/office/drawing/2016/5/14/chartex" xmlns:mc="http://schemas.openxmlformats.org/markup-compatibility/2006" xmlns:aink="http://schemas.microsoft.com/office/drawing/2016/ink" xmlns:am3d="http://schemas.microsoft.com/office/drawing/2017/model3d" xmlns:o="urn:schemas-microsoft-com:office:office" xmlns:r="http://schemas.openxmlformats.org/officeDocument/2006/relationships" xmlns:m="http://schemas.openxmlformats.org/officeDocument/2006/math" xmlns:v="urn:schemas-microsoft-com:vml" xmlns:wp14="http://schemas.microsoft.com/office/word/2010/wordprocessingDrawing" xmlns:wp="http://schemas.openxmlformats.org/drawingml/2006/wordprocessingDrawing" xmlns:w10="urn:schemas-microsoft-com:office:word" xmlns:w="http://schemas.openxmlformats.org/wordprocessingml/2006/main" xmlns:w14="http://schemas.microsoft.com/office/word/2010/wordml" xmlns:w15="http://schemas.microsoft.com/office/word/2012/wordml" xmlns:w16cid="http://schemas.microsoft.com/office/word/2016/wordml/cid" xmlns:w16se="http://schemas.microsoft.com/office/word/2015/wordml/symex" xmlns:wpg="http://schemas.microsoft.com/office/word/2010/wordprocessingGroup" xmlns:wpi="http://schemas.microsoft.com/office/word/2010/wordprocessingInk" xmlns:wne="http://schemas.microsoft.com/office/word/2006/wordml" xmlns:wps="http://schemas.microsoft.com/office/word/2010/wordprocessingShape" mc:Ignorable="w14 w15 w16se w16cid wp14">
   <w:body>
     <w:p>
       <w:pPr>
@@ -177,8 +177,8 @@
     </w:p>
     <w:p>
       <w:pPr>
+        <w:spacing w:after="120" w:line="276" w:lineRule="auto"/>
         <w:jc w:val="center"/>
-        <w:spacing w:after="120" w:line="276" w:lineRule="auto"/>
       </w:pPr>
       <w:r>
         <w:rPr>
@@ -187,14 +187,14 @@
           <w:sz w:val="28"/>
           <w:szCs w:val="28"/>
         </w:rPr>
-        <w:t xml:space="preserve">##ChucVuNguoiDungDau##</w:t>
+        <w:t>##ChucVuNguoiDungDau##</w:t>
       </w:r>
     </w:p>
     <w:p>
       <w:pPr>
+        <w:spacing w:after="120" w:line="276" w:lineRule="auto"/>
+        <w:ind w:firstLine="567"/>
         <w:jc w:val="both"/>
-        <w:ind w:firstLine="567"/>
-        <w:spacing w:after="120" w:line="276" w:lineRule="auto"/>
       </w:pPr>
       <w:r>
         <w:rPr>
@@ -202,14 +202,14 @@
           <w:sz w:val="28"/>
           <w:szCs w:val="28"/>
         </w:rPr>
-        <w:t xml:space="preserve">Căn cứ khoản 1 Điều 43 Luật Trách nhiệm bồi thường của Nhà nước số 10/2017/QH14 (được sửa đổi, bổ sung bởi Luật số 81/2025/QH15 và Luật số 15/2026/QH16);</w:t>
+        <w:t>Căn cứ khoản 1 Điều 43 Luật Trách nhiệm bồi thường của Nhà nước số 10/2017/QH14 (được sửa đổi, bổ sung bởi Luật số 81/2025/QH15 và Luật số 15/2026/QH16);</w:t>
       </w:r>
     </w:p>
     <w:p>
       <w:pPr>
+        <w:spacing w:after="120" w:line="276" w:lineRule="auto"/>
+        <w:ind w:firstLine="567"/>
         <w:jc w:val="both"/>
-        <w:ind w:firstLine="567"/>
-        <w:spacing w:after="120" w:line="276" w:lineRule="auto"/>
       </w:pPr>
       <w:r>
         <w:rPr>
@@ -217,13 +217,13 @@
           <w:sz w:val="28"/>
           <w:szCs w:val="28"/>
         </w:rPr>
-        <w:t xml:space="preserve">Để giải quyết yêu cầu bồi thường của Ông/Bà ##TenNguoiYeuCauBoiThuong##,</w:t>
+        <w:t>Để giải quyết yêu cầu bồi thường của Ông/Bà ##TenNguoiYeuCauBoiThuong##,</w:t>
       </w:r>
     </w:p>
     <w:p>
       <w:pPr>
+        <w:spacing w:after="120" w:line="276" w:lineRule="auto"/>
         <w:jc w:val="center"/>
-        <w:spacing w:after="120" w:line="276" w:lineRule="auto"/>
       </w:pPr>
       <w:r>
         <w:rPr>
@@ -231,14 +231,14 @@
           <w:sz w:val="28"/>
           <w:szCs w:val="28"/>
         </w:rPr>
-        <w:t xml:space="preserve">QUYẾT ĐỊNH:</w:t>
+        <w:t>QUYẾT ĐỊNH:</w:t>
       </w:r>
     </w:p>
     <w:p>
       <w:pPr>
+        <w:spacing w:after="120" w:line="276" w:lineRule="auto"/>
+        <w:ind w:firstLine="567"/>
         <w:jc w:val="both"/>
-        <w:ind w:firstLine="567"/>
-        <w:spacing w:after="120" w:line="276" w:lineRule="auto"/>
       </w:pPr>
       <w:r>
         <w:rPr>
@@ -247,21 +247,39 @@
           <w:sz w:val="28"/>
           <w:szCs w:val="28"/>
         </w:rPr>
-        <w:t>Điều 1.</w:t>
-      </w:r>
-      <w:r>
-        <w:rPr>
-          <w:sz w:val="28"/>
-          <w:szCs w:val="28"/>
-        </w:rPr>
-        <w:t xml:space="preserve"> Cử Ông/Bà ##HoTenNguoiGiaiQuyet## Chức vụ: ##ChucVuNguoiGiaiQuyet## là người giải quyết bồi thường đối với yêu cầu bồi thường của Ông/Bà ##TenNguoiYeuCauBoiThuong## Địa chỉ: ##DiaChiNguoiYeuCauBoiThuong##</w:t>
+        <w:t xml:space="preserve">Điều </w:t>
+      </w:r>
+      <w:bookmarkStart w:id="0" w:name="_GoBack"/>
+      <w:bookmarkEnd w:id="0"/>
+      <w:r>
+        <w:rPr>
+          <w:b/>
+          <w:bCs/>
+          <w:sz w:val="28"/>
+          <w:szCs w:val="28"/>
+        </w:rPr>
+        <w:t>1.</w:t>
+      </w:r>
+      <w:r>
+        <w:rPr>
+          <w:sz w:val="28"/>
+          <w:szCs w:val="28"/>
+        </w:rPr>
+        <w:t xml:space="preserve"> Cử Ông/Bà ##HoTenNguoiGiaiQuyet## Chức vụ: ##ChucVuNguoiGiaiQuyet## là người giải quyết bồi thường đối với yêu cầu bồi thường của Ông/Bà ##TenNguoiYeuCauBoiThuong</w:t>
+      </w:r>
+      <w:r>
+        <w:rPr>
+          <w:sz w:val="28"/>
+          <w:szCs w:val="28"/>
+        </w:rPr>
+        <w:t>## Địa chỉ: ##DiaChiNguoiYeuCauBoiThuong##</w:t>
       </w:r>
     </w:p>
     <w:p>
       <w:pPr>
+        <w:spacing w:after="120" w:line="276" w:lineRule="auto"/>
+        <w:ind w:firstLine="567"/>
         <w:jc w:val="both"/>
-        <w:ind w:firstLine="567"/>
-        <w:spacing w:after="120" w:line="276" w:lineRule="auto"/>
       </w:pPr>
       <w:r>
         <w:rPr>
@@ -282,9 +300,9 @@
     </w:p>
     <w:p>
       <w:pPr>
+        <w:spacing w:after="120" w:line="276" w:lineRule="auto"/>
+        <w:ind w:firstLine="567"/>
         <w:jc w:val="both"/>
-        <w:ind w:firstLine="567"/>
-        <w:spacing w:after="120" w:line="276" w:lineRule="auto"/>
       </w:pPr>
       <w:r>
         <w:rPr>
@@ -305,9 +323,9 @@
     </w:p>
     <w:p>
       <w:pPr>
+        <w:spacing w:after="120" w:line="276" w:lineRule="auto"/>
+        <w:ind w:firstLine="567"/>
         <w:jc w:val="both"/>
-        <w:ind w:firstLine="567"/>
-        <w:spacing w:after="120" w:line="276" w:lineRule="auto"/>
       </w:pPr>
       <w:r>
         <w:rPr>
@@ -323,7 +341,14 @@
           <w:sz w:val="28"/>
           <w:szCs w:val="28"/>
         </w:rPr>
-        <w:t xml:space="preserve"> Ông/Bà ##HoTenNguoiGiaiQuyet## và những người có liên quan chịu trách nhiệm thi hành Quyết định này./.</w:t>
+        <w:t xml:space="preserve"> Ông/Bà ##HoTenNguoiGiaiQuye</w:t>
+      </w:r>
+      <w:r>
+        <w:rPr>
+          <w:sz w:val="28"/>
+          <w:szCs w:val="28"/>
+        </w:rPr>
+        <w:t>t## và những người có liên quan chịu trách nhiệm thi hành Quyết định này./.</w:t>
       </w:r>
     </w:p>
     <w:tbl>
@@ -369,7 +394,7 @@
                 <w:sz w:val="22"/>
                 <w:szCs w:val="22"/>
               </w:rPr>
-              <w:t xml:space="preserve">##NoiNhan##</w:t>
+              <w:t>##NoiNhan##</w:t>
             </w:r>
           </w:p>
         </w:tc>
@@ -422,6 +447,7 @@
         </w:tc>
       </w:tr>
     </w:tbl>
+    <w:p/>
     <w:sectPr>
       <w:pgSz w:w="11906" w:h="16838"/>
       <w:pgMar w:top="1134" w:right="850" w:bottom="1134" w:left="1701" w:header="567" w:footer="567" w:gutter="0"/>

</xml_diff>